<commit_message>
Format LME032 validation hyperlinks blue and underlined
</commit_message>
<xml_diff>
--- a/regions/LME_032/Model_validation_32_1_Arabian_Sea_off_Karnataka_(2000).docx
+++ b/regions/LME_032/Model_validation_32_1_Arabian_Sea_off_Karnataka_(2000).docx
@@ -169,6 +169,8 @@
               <w:r>
                 <w:rPr>
                   <w:rStyle w:val="Hyperlink"/>
+                  <w:color w:val="0563C1"/>
+                  <w:u w:val="single"/>
                 </w:rPr>
                 <w:t>Regional workbook</w:t>
               </w:r>
@@ -252,6 +254,8 @@
               <w:r>
                 <w:rPr>
                   <w:rStyle w:val="Hyperlink"/>
+                  <w:color w:val="0563C1"/>
+                  <w:u w:val="single"/>
                 </w:rPr>
                 <w:t>Catch files</w:t>
               </w:r>
@@ -263,6 +267,8 @@
               <w:r>
                 <w:rPr>
                   <w:rStyle w:val="Hyperlink"/>
+                  <w:color w:val="0563C1"/>
+                  <w:u w:val="single"/>
                 </w:rPr>
                 <w:t>Taxon metadata</w:t>
               </w:r>
@@ -346,6 +352,8 @@
               <w:r>
                 <w:rPr>
                   <w:rStyle w:val="Hyperlink"/>
+                  <w:color w:val="0563C1"/>
+                  <w:u w:val="single"/>
                 </w:rPr>
                 <w:t>Paper PDF</w:t>
               </w:r>
@@ -357,6 +365,8 @@
               <w:r>
                 <w:rPr>
                   <w:rStyle w:val="Hyperlink"/>
+                  <w:color w:val="0563C1"/>
+                  <w:u w:val="single"/>
                 </w:rPr>
                 <w:t>Official source</w:t>
               </w:r>
@@ -440,6 +450,8 @@
               <w:r>
                 <w:rPr>
                   <w:rStyle w:val="Hyperlink"/>
+                  <w:color w:val="0563C1"/>
+                  <w:u w:val="single"/>
                 </w:rPr>
                 <w:t>Mohamed-2009 PDF</w:t>
               </w:r>
@@ -451,6 +463,8 @@
               <w:r>
                 <w:rPr>
                   <w:rStyle w:val="Hyperlink"/>
+                  <w:color w:val="0563C1"/>
+                  <w:u w:val="single"/>
                 </w:rPr>
                 <w:t>Mohamed-2024 PDF</w:t>
               </w:r>
@@ -462,6 +476,8 @@
               <w:r>
                 <w:rPr>
                   <w:rStyle w:val="Hyperlink"/>
+                  <w:color w:val="0563C1"/>
+                  <w:u w:val="single"/>
                 </w:rPr>
                 <w:t>Vivekanandan-2003 PDF</w:t>
               </w:r>
@@ -545,6 +561,8 @@
               <w:r>
                 <w:rPr>
                   <w:rStyle w:val="Hyperlink"/>
+                  <w:color w:val="0563C1"/>
+                  <w:u w:val="single"/>
                 </w:rPr>
                 <w:t>Model JSON</w:t>
               </w:r>
@@ -556,6 +574,8 @@
               <w:r>
                 <w:rPr>
                   <w:rStyle w:val="Hyperlink"/>
+                  <w:color w:val="0563C1"/>
+                  <w:u w:val="single"/>
                 </w:rPr>
                 <w:t>Group coefficients</w:t>
               </w:r>
@@ -783,6 +803,8 @@
               <w:r>
                 <w:rPr>
                   <w:rStyle w:val="Hyperlink"/>
+                  <w:color w:val="0563C1"/>
+                  <w:u w:val="single"/>
                 </w:rPr>
                 <w:t>Source reconstruction</w:t>
               </w:r>
@@ -794,6 +816,8 @@
               <w:r>
                 <w:rPr>
                   <w:rStyle w:val="Hyperlink"/>
+                  <w:color w:val="0563C1"/>
+                  <w:u w:val="single"/>
                 </w:rPr>
                 <w:t>Loaded state</w:t>
               </w:r>
@@ -1346,6 +1370,8 @@
               <w:r>
                 <w:rPr>
                   <w:rStyle w:val="Hyperlink"/>
+                  <w:color w:val="0563C1"/>
+                  <w:u w:val="single"/>
                 </w:rPr>
                 <w:t>Diagnostic evidence</w:t>
               </w:r>
@@ -1610,6 +1636,8 @@
         <w:r>
           <w:rPr>
             <w:rStyle w:val="Hyperlink"/>
+            <w:color w:val="0563C1"/>
+            <w:u w:val="single"/>
           </w:rPr>
           <w:t>Excel taxon appendix and descriptive Sources sheet</w:t>
         </w:r>
@@ -4262,6 +4290,8 @@
         <w:r>
           <w:rPr>
             <w:rStyle w:val="Hyperlink"/>
+            <w:color w:val="0563C1"/>
+            <w:u w:val="single"/>
           </w:rPr>
           <w:t>Boundary source</w:t>
         </w:r>
@@ -4273,6 +4303,8 @@
         <w:r>
           <w:rPr>
             <w:rStyle w:val="Hyperlink"/>
+            <w:color w:val="0563C1"/>
+            <w:u w:val="single"/>
           </w:rPr>
           <w:t>Overlap evidence</w:t>
         </w:r>
@@ -4426,6 +4458,8 @@
         <w:r>
           <w:rPr>
             <w:rStyle w:val="Hyperlink"/>
+            <w:color w:val="0563C1"/>
+            <w:u w:val="single"/>
           </w:rPr>
           <w:t>Source PDF</w:t>
         </w:r>
@@ -16488,6 +16522,20 @@
         <w:shd w:val="clear" w:color="auto" w:fill="FBCAA2" w:themeFill="accent6" w:themeFillTint="7F"/>
       </w:tcPr>
     </w:tblStylePr>
+  </w:style>
+  <w:style w:type="character" w:styleId="Hyperlink">
+    <w:name w:val="Hyperlink"/>
+    <w:rPr>
+      <w:color w:val="0563C1"/>
+      <w:u w:val="single"/>
+    </w:rPr>
+  </w:style>
+  <w:style w:type="character" w:styleId="FollowedHyperlink">
+    <w:name w:val="FollowedHyperlink"/>
+    <w:rPr>
+      <w:color w:val="0563C1"/>
+      <w:u w:val="single"/>
+    </w:rPr>
   </w:style>
 </w:styles>
 </file>

</xml_diff>

<commit_message>
Complete validation reviews for all 23 selected regions
Reassess taxonomy, complete candidate membership, allocation evidence and confidence while preserving accepted scientific parameters and researcher fields. Retain regional DOCX reports, linked Excel appendices and reproducible source, diagnostic and arithmetic evidence.

Reconcile selected models and annual results with Project.xlsx, map, trends and archive; make current availability distinct from diagnostic grade and scientific approval. Verify portable Office links, relocated generated pages, calculation controls and exports.

Integrate reviewed workflow lessons and refresh the knowledge graph with preserved evidence, full-byte freshness checks and all-region retrieval. Validation: 56 workflow tests, 16 verifier regression checks, all 23 protected-input/serialization and shared-output reconciliations.
</commit_message>
<xml_diff>
--- a/regions/LME_032/Model_validation_32_1_Arabian_Sea_off_Karnataka_(2000).docx
+++ b/regions/LME_032/Model_validation_32_1_Arabian_Sea_off_Karnataka_(2000).docx
@@ -1289,7 +1289,7 @@
                 <w:sz w:val="21"/>
                 <w:color w:val="000000"/>
               </w:rPr>
-              <w:t>Model baseline 1999–2001 is transferred over catch 1950–2019, including the 2019 reference. Fixed model coefficients and assumed category weights do not reconstruct changing annual ecosystems. Regional lineage weights use identified total catch 1950–2019, then transfer across individual years and bases.</w:t>
+              <w:t>Model baseline 1999–2001 is transferred over catch 1950–2019, including the 2019 reference. Fixed model coefficients and assumed category weights do not reconstruct changing annual ecosystems. Regional lineage weights use identified total catch 1950–2019, then transfer across individual years and bases. Catfish and flatfish proxy weights have substantial reporting geography, gear or period mismatches.</w:t>
             </w:r>
           </w:p>
         </w:tc>
@@ -2003,7 +2003,7 @@
                 <w:color w:val="000000"/>
                 <w:sz w:val="20"/>
               </w:rPr>
-              <w:t>207</w:t>
+              <w:t>205</w:t>
             </w:r>
           </w:p>
         </w:tc>
@@ -2037,7 +2037,7 @@
                 <w:color w:val="000000"/>
                 <w:sz w:val="20"/>
               </w:rPr>
-              <w:t>49.3950%</w:t>
+              <w:t>48.5275%</w:t>
             </w:r>
           </w:p>
         </w:tc>
@@ -2071,7 +2071,7 @@
                 <w:color w:val="000000"/>
                 <w:sz w:val="20"/>
               </w:rPr>
-              <w:t>64.5210%</w:t>
+              <w:t>64.2253%</w:t>
             </w:r>
           </w:p>
         </w:tc>
@@ -2143,7 +2143,7 @@
                 <w:color w:val="000000"/>
                 <w:sz w:val="20"/>
               </w:rPr>
-              <w:t>38</w:t>
+              <w:t>40</w:t>
             </w:r>
           </w:p>
         </w:tc>
@@ -2177,7 +2177,7 @@
                 <w:color w:val="000000"/>
                 <w:sz w:val="20"/>
               </w:rPr>
-              <w:t>3.2033%</w:t>
+              <w:t>4.0707%</w:t>
             </w:r>
           </w:p>
         </w:tc>
@@ -2211,7 +2211,7 @@
                 <w:color w:val="000000"/>
                 <w:sz w:val="20"/>
               </w:rPr>
-              <w:t>4.2734%</w:t>
+              <w:t>4.5692%</w:t>
             </w:r>
           </w:p>
         </w:tc>
@@ -3959,7 +3959,7 @@
                 <w:color w:val="000000"/>
                 <w:sz w:val="20"/>
               </w:rPr>
-              <w:t>6.4246%</w:t>
+              <w:t>6.1289%</w:t>
             </w:r>
           </w:p>
         </w:tc>
@@ -4070,6 +4070,112 @@
           </w:p>
         </w:tc>
       </w:tr>
+      <w:tr>
+        <w:trPr>
+          <w:cantSplit/>
+        </w:trPr>
+        <w:tc>
+          <w:tcPr>
+            <w:tcW w:type="dxa" w:w="6624"/>
+            <w:shd w:fill="FFFFFF"/>
+            <w:tcBorders>
+              <w:top w:val="single" w:sz="4" w:color="D9D9D9"/>
+              <w:left w:val="single" w:sz="4" w:color="D9D9D9"/>
+              <w:bottom w:val="single" w:sz="4" w:color="D9D9D9"/>
+              <w:right w:val="single" w:sz="4" w:color="D9D9D9"/>
+            </w:tcBorders>
+            <w:tcMar>
+              <w:top w:w="75" w:type="dxa"/>
+              <w:left w:w="75" w:type="dxa"/>
+              <w:bottom w:w="75" w:type="dxa"/>
+              <w:right w:w="75" w:type="dxa"/>
+            </w:tcMar>
+          </w:tcPr>
+          <w:p>
+            <w:pPr>
+              <w:keepNext w:val="0"/>
+              <w:spacing w:after="40" w:before="40"/>
+            </w:pPr>
+            <w:r>
+              <w:rPr>
+                <w:rFonts w:ascii="Calibri" w:hAnsi="Calibri"/>
+                <w:b w:val="0"/>
+                <w:color w:val="000000"/>
+                <w:sz w:val="20"/>
+              </w:rPr>
+              <w:t>Identified regional catch composition assumed for the coarse taxon</w:t>
+            </w:r>
+          </w:p>
+        </w:tc>
+        <w:tc>
+          <w:tcPr>
+            <w:tcW w:type="dxa" w:w="1512"/>
+            <w:shd w:fill="FFFFFF"/>
+            <w:tcBorders>
+              <w:top w:val="single" w:sz="4" w:color="D9D9D9"/>
+              <w:left w:val="single" w:sz="4" w:color="D9D9D9"/>
+              <w:bottom w:val="single" w:sz="4" w:color="D9D9D9"/>
+              <w:right w:val="single" w:sz="4" w:color="D9D9D9"/>
+            </w:tcBorders>
+            <w:tcMar>
+              <w:top w:w="75" w:type="dxa"/>
+              <w:left w:w="75" w:type="dxa"/>
+              <w:bottom w:w="75" w:type="dxa"/>
+              <w:right w:w="75" w:type="dxa"/>
+            </w:tcMar>
+          </w:tcPr>
+          <w:p>
+            <w:pPr>
+              <w:keepNext w:val="0"/>
+              <w:spacing w:after="40" w:before="40"/>
+              <w:jc w:val="center"/>
+            </w:pPr>
+            <w:r>
+              <w:rPr>
+                <w:rFonts w:ascii="Calibri" w:hAnsi="Calibri"/>
+                <w:b w:val="0"/>
+                <w:color w:val="000000"/>
+                <w:sz w:val="20"/>
+              </w:rPr>
+              <w:t>Low</w:t>
+            </w:r>
+          </w:p>
+        </w:tc>
+        <w:tc>
+          <w:tcPr>
+            <w:tcW w:type="dxa" w:w="1872"/>
+            <w:shd w:fill="FFFFFF"/>
+            <w:tcBorders>
+              <w:top w:val="single" w:sz="4" w:color="D9D9D9"/>
+              <w:left w:val="single" w:sz="4" w:color="D9D9D9"/>
+              <w:bottom w:val="single" w:sz="4" w:color="D9D9D9"/>
+              <w:right w:val="single" w:sz="4" w:color="D9D9D9"/>
+            </w:tcBorders>
+            <w:tcMar>
+              <w:top w:w="75" w:type="dxa"/>
+              <w:left w:w="75" w:type="dxa"/>
+              <w:bottom w:w="75" w:type="dxa"/>
+              <w:right w:w="75" w:type="dxa"/>
+            </w:tcMar>
+          </w:tcPr>
+          <w:p>
+            <w:pPr>
+              <w:keepNext w:val="0"/>
+              <w:spacing w:after="40" w:before="40"/>
+              <w:jc w:val="center"/>
+            </w:pPr>
+            <w:r>
+              <w:rPr>
+                <w:rFonts w:ascii="Calibri" w:hAnsi="Calibri"/>
+                <w:b w:val="0"/>
+                <w:color w:val="000000"/>
+                <w:sz w:val="20"/>
+              </w:rPr>
+              <w:t>0.2958%</w:t>
+            </w:r>
+          </w:p>
+        </w:tc>
+      </w:tr>
     </w:tbl>
     <w:p>
       <w:pPr>
@@ -4084,7 +4190,7 @@
           <w:color w:val="000000"/>
           <w:sz w:val="21"/>
         </w:rPr>
-        <w:t>Weights and assumptions: seven identified-lineage catch mixtures are retained or reconstructed. Other splits use eligible source-group landings proportions at Medium allocation confidence, with zero candidates retained and transfer assumptions explicit.</w:t>
+        <w:t>Weights and assumptions: seven identified-lineage catch mixtures are retained or reconstructed. Other splits use eligible source-group landings proportions at Medium allocation confidence, with zero candidates retained and transfer assumptions explicit. Siluriformes and Pleuronectiformes retain lineage splits at Low allocation confidence because reporting geography, gears or periods differ.</w:t>
       </w:r>
     </w:p>
     <w:p>

</xml_diff>